<commit_message>
Update Shimanto project report part
</commit_message>
<xml_diff>
--- a/Shimanto -Part.docx
+++ b/Shimanto -Part.docx
@@ -245,9 +245,10 @@
             <w:pPr>
               <w:spacing w:after="0" w:line="240" w:lineRule="auto"/>
               <w:rPr>
-                <w:rFonts w:ascii="Times New Roman" w:hAnsi="Times New Roman" w:cs="Times New Roman"/>
-                <w:sz w:val="24"/>
-                <w:szCs w:val="24"/>
+                <w:rFonts w:hint="default" w:ascii="Times New Roman" w:hAnsi="Times New Roman" w:cs="Times New Roman"/>
+                <w:sz w:val="24"/>
+                <w:szCs w:val="24"/>
+                <w:lang w:val="en-US"/>
               </w:rPr>
             </w:pPr>
             <w:r>
@@ -372,36 +373,96 @@
                 </mc:Fallback>
               </mc:AlternateContent>
             </w:r>
-          </w:p>
-          <w:p>
-            <w:pPr>
-              <w:spacing w:after="0" w:line="240" w:lineRule="auto"/>
-              <w:rPr>
-                <w:rFonts w:ascii="Times New Roman" w:hAnsi="Times New Roman" w:cs="Times New Roman"/>
-                <w:sz w:val="24"/>
-                <w:szCs w:val="24"/>
-              </w:rPr>
-            </w:pPr>
-          </w:p>
-          <w:p>
-            <w:pPr>
-              <w:spacing w:after="0" w:line="240" w:lineRule="auto"/>
-              <w:rPr>
-                <w:rFonts w:ascii="Times New Roman" w:hAnsi="Times New Roman" w:cs="Times New Roman"/>
-                <w:sz w:val="24"/>
-                <w:szCs w:val="24"/>
-              </w:rPr>
-            </w:pPr>
-          </w:p>
-          <w:p>
-            <w:pPr>
-              <w:spacing w:after="0" w:line="240" w:lineRule="auto"/>
-              <w:rPr>
-                <w:rFonts w:ascii="Times New Roman" w:hAnsi="Times New Roman" w:cs="Times New Roman"/>
-                <w:sz w:val="24"/>
-                <w:szCs w:val="24"/>
-              </w:rPr>
-            </w:pPr>
+            <w:r>
+              <w:rPr>
+                <w:rFonts w:hint="default" w:ascii="Times New Roman" w:hAnsi="Times New Roman" w:cs="Times New Roman"/>
+                <w:sz w:val="24"/>
+                <w:szCs w:val="24"/>
+                <w:lang w:val="en-US"/>
+              </w:rPr>
+              <w:t>A/An</w:t>
+            </w:r>
+          </w:p>
+          <w:p>
+            <w:pPr>
+              <w:spacing w:after="0" w:line="240" w:lineRule="auto"/>
+              <w:rPr>
+                <w:rFonts w:ascii="Times New Roman" w:hAnsi="Times New Roman" w:cs="Times New Roman"/>
+                <w:sz w:val="24"/>
+                <w:szCs w:val="24"/>
+              </w:rPr>
+            </w:pPr>
+            <w:r>
+              <w:rPr>
+                <w:sz w:val="24"/>
+              </w:rPr>
+              <mc:AlternateContent>
+                <mc:Choice Requires="wps">
+                  <w:drawing>
+                    <wp:anchor distT="0" distB="0" distL="114300" distR="114300" simplePos="0" relativeHeight="251664384" behindDoc="0" locked="0" layoutInCell="1" allowOverlap="1">
+                      <wp:simplePos x="0" y="0"/>
+                      <wp:positionH relativeFrom="column">
+                        <wp:posOffset>-86995</wp:posOffset>
+                      </wp:positionH>
+                      <wp:positionV relativeFrom="paragraph">
+                        <wp:posOffset>32385</wp:posOffset>
+                      </wp:positionV>
+                      <wp:extent cx="1495425" cy="9525"/>
+                      <wp:effectExtent l="0" t="6350" r="9525" b="12700"/>
+                      <wp:wrapNone/>
+                      <wp:docPr id="6" name="Straight Connector 6"/>
+                      <wp:cNvGraphicFramePr/>
+                      <a:graphic xmlns:a="http://schemas.openxmlformats.org/drawingml/2006/main">
+                        <a:graphicData uri="http://schemas.microsoft.com/office/word/2010/wordprocessingShape">
+                          <wps:wsp>
+                            <wps:cNvCnPr/>
+                            <wps:spPr>
+                              <a:xfrm flipH="1" flipV="1">
+                                <a:off x="1747520" y="1137285"/>
+                                <a:ext cx="1495425" cy="9525"/>
+                              </a:xfrm>
+                              <a:prstGeom prst="line">
+                                <a:avLst/>
+                              </a:prstGeom>
+                              <a:ln>
+                                <a:solidFill>
+                                  <a:schemeClr val="tx1"/>
+                                </a:solidFill>
+                              </a:ln>
+                            </wps:spPr>
+                            <wps:style>
+                              <a:lnRef idx="2">
+                                <a:schemeClr val="accent1"/>
+                              </a:lnRef>
+                              <a:fillRef idx="0">
+                                <a:srgbClr val="FFFFFF"/>
+                              </a:fillRef>
+                              <a:effectRef idx="0">
+                                <a:srgbClr val="FFFFFF"/>
+                              </a:effectRef>
+                              <a:fontRef idx="minor">
+                                <a:schemeClr val="tx1"/>
+                              </a:fontRef>
+                            </wps:style>
+                            <wps:bodyPr/>
+                          </wps:wsp>
+                        </a:graphicData>
+                      </a:graphic>
+                    </wp:anchor>
+                  </w:drawing>
+                </mc:Choice>
+                <mc:Fallback>
+                  <w:pict>
+                    <v:line id="_x0000_s1026" o:spid="_x0000_s1026" o:spt="20" style="position:absolute;left:0pt;flip:x y;margin-left:-6.85pt;margin-top:2.55pt;height:0.75pt;width:117.75pt;z-index:251664384;mso-width-relative:page;mso-height-relative:page;" filled="f" stroked="t" coordsize="21600,21600" o:gfxdata="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">
+                      <v:fill on="f" focussize="0,0"/>
+                      <v:stroke weight="1pt" color="#000000 [3213]" miterlimit="8" joinstyle="miter"/>
+                      <v:imagedata o:title=""/>
+                      <o:lock v:ext="edit" aspectratio="f"/>
+                    </v:line>
+                  </w:pict>
+                </mc:Fallback>
+              </mc:AlternateContent>
+            </w:r>
           </w:p>
           <w:p>
             <w:pPr>
@@ -530,38 +591,20 @@
             <w:pPr>
               <w:spacing w:after="0" w:line="240" w:lineRule="auto"/>
               <w:rPr>
-                <w:rFonts w:ascii="Times New Roman" w:hAnsi="Times New Roman" w:cs="Times New Roman"/>
-                <w:sz w:val="24"/>
-                <w:szCs w:val="24"/>
-              </w:rPr>
-            </w:pPr>
-          </w:p>
-          <w:p>
-            <w:pPr>
-              <w:spacing w:after="0" w:line="240" w:lineRule="auto"/>
-              <w:rPr>
-                <w:rFonts w:ascii="Times New Roman" w:hAnsi="Times New Roman" w:cs="Times New Roman"/>
-                <w:sz w:val="24"/>
-                <w:szCs w:val="24"/>
-              </w:rPr>
-            </w:pPr>
-          </w:p>
-          <w:p>
-            <w:pPr>
-              <w:spacing w:after="0" w:line="240" w:lineRule="auto"/>
-              <w:rPr>
-                <w:rFonts w:ascii="Times New Roman" w:hAnsi="Times New Roman" w:cs="Times New Roman"/>
-                <w:sz w:val="24"/>
-                <w:szCs w:val="24"/>
-              </w:rPr>
-            </w:pPr>
-            <w:r>
-              <w:rPr>
-                <w:rFonts w:ascii="Times New Roman" w:hAnsi="Times New Roman" w:cs="Times New Roman"/>
-                <w:sz w:val="24"/>
-                <w:szCs w:val="24"/>
-              </w:rPr>
-              <w:t>Create an account</w:t>
+                <w:rFonts w:hint="default" w:ascii="Times New Roman" w:hAnsi="Times New Roman" w:cs="Times New Roman"/>
+                <w:sz w:val="24"/>
+                <w:szCs w:val="24"/>
+                <w:lang w:val="en-US"/>
+              </w:rPr>
+            </w:pPr>
+            <w:r>
+              <w:rPr>
+                <w:rFonts w:hint="default" w:ascii="Times New Roman" w:hAnsi="Times New Roman" w:cs="Times New Roman"/>
+                <w:sz w:val="24"/>
+                <w:szCs w:val="24"/>
+                <w:lang w:val="en-US"/>
+              </w:rPr>
+              <w:t>I want to</w:t>
             </w:r>
           </w:p>
         </w:tc>
@@ -573,18 +616,20 @@
             <w:pPr>
               <w:spacing w:after="0" w:line="240" w:lineRule="auto"/>
               <w:rPr>
-                <w:rFonts w:ascii="Times New Roman" w:hAnsi="Times New Roman" w:cs="Times New Roman"/>
-                <w:sz w:val="24"/>
-                <w:szCs w:val="24"/>
-              </w:rPr>
-            </w:pPr>
-            <w:r>
-              <w:rPr>
-                <w:rFonts w:ascii="Times New Roman" w:hAnsi="Times New Roman" w:cs="Times New Roman"/>
-                <w:sz w:val="24"/>
-                <w:szCs w:val="24"/>
-              </w:rPr>
-              <w:t xml:space="preserve"> I can use the service</w:t>
+                <w:rFonts w:hint="default" w:ascii="Times New Roman" w:hAnsi="Times New Roman" w:cs="Times New Roman"/>
+                <w:sz w:val="24"/>
+                <w:szCs w:val="24"/>
+                <w:lang w:val="en-US"/>
+              </w:rPr>
+            </w:pPr>
+            <w:r>
+              <w:rPr>
+                <w:rFonts w:hint="default" w:ascii="Times New Roman" w:hAnsi="Times New Roman" w:cs="Times New Roman"/>
+                <w:sz w:val="24"/>
+                <w:szCs w:val="24"/>
+                <w:lang w:val="en-US"/>
+              </w:rPr>
+              <w:t>So that</w:t>
             </w:r>
           </w:p>
         </w:tc>
@@ -596,18 +641,19 @@
             <w:pPr>
               <w:spacing w:after="0" w:line="240" w:lineRule="auto"/>
               <w:rPr>
-                <w:rFonts w:ascii="Times New Roman" w:hAnsi="Times New Roman" w:cs="Times New Roman"/>
-                <w:sz w:val="24"/>
-                <w:szCs w:val="24"/>
-              </w:rPr>
-            </w:pPr>
-            <w:r>
-              <w:rPr>
-                <w:rFonts w:ascii="Times New Roman" w:hAnsi="Times New Roman" w:cs="Times New Roman"/>
-                <w:sz w:val="24"/>
-                <w:szCs w:val="24"/>
-              </w:rPr>
-              <w:t>OTP sent to mobile/email for verification</w:t>
+                <w:rFonts w:hint="default" w:ascii="Times New Roman" w:hAnsi="Times New Roman" w:cs="Times New Roman"/>
+                <w:sz w:val="24"/>
+                <w:szCs w:val="24"/>
+                <w:lang w:val="en-US"/>
+              </w:rPr>
+            </w:pPr>
+            <w:r>
+              <w:rPr>
+                <w:rFonts w:ascii="Times" w:hAnsi="Times" w:cs="Times"/>
+                <w:sz w:val="24"/>
+                <w:szCs w:val="24"/>
+              </w:rPr>
+              <w:t>Acceptance Criteria</w:t>
             </w:r>
           </w:p>
         </w:tc>
@@ -633,6 +679,7 @@
           <w:tcPr>
             <w:tcW w:w="2337" w:type="dxa"/>
             <w:vMerge w:val="continue"/>
+            <w:tcBorders/>
           </w:tcPr>
           <w:p>
             <w:pPr>
@@ -648,87 +695,78 @@
         <w:tc>
           <w:tcPr>
             <w:tcW w:w="2337" w:type="dxa"/>
-          </w:tcPr>
-          <w:p>
-            <w:pPr>
-              <w:spacing w:after="0" w:line="240" w:lineRule="auto"/>
-              <w:rPr>
-                <w:rFonts w:ascii="Times New Roman" w:hAnsi="Times New Roman" w:cs="Times New Roman"/>
-                <w:sz w:val="24"/>
-                <w:szCs w:val="24"/>
-              </w:rPr>
-            </w:pPr>
-            <w:r>
-              <w:rPr>
-                <w:rFonts w:ascii="Times New Roman" w:hAnsi="Times New Roman" w:cs="Times New Roman"/>
-                <w:sz w:val="24"/>
-                <w:szCs w:val="24"/>
-              </w:rPr>
-              <w:t>Login</w:t>
+            <w:shd w:val="clear"/>
+            <w:vAlign w:val="top"/>
+          </w:tcPr>
+          <w:p>
+            <w:pPr>
+              <w:spacing w:after="0" w:line="240" w:lineRule="auto"/>
+              <w:rPr>
+                <w:rFonts w:ascii="Times New Roman" w:hAnsi="Times New Roman" w:cs="Times New Roman" w:eastAsiaTheme="minorEastAsia"/>
+                <w:sz w:val="24"/>
+                <w:szCs w:val="24"/>
+                <w:lang w:val="en-US" w:eastAsia="zh-CN" w:bidi="ar-SA"/>
+              </w:rPr>
+            </w:pPr>
+            <w:r>
+              <w:rPr>
+                <w:rFonts w:ascii="Times New Roman" w:hAnsi="Times New Roman" w:cs="Times New Roman"/>
+                <w:sz w:val="24"/>
+                <w:szCs w:val="24"/>
+              </w:rPr>
+              <w:t>Create an account</w:t>
             </w:r>
           </w:p>
         </w:tc>
         <w:tc>
           <w:tcPr>
             <w:tcW w:w="2338" w:type="dxa"/>
-          </w:tcPr>
-          <w:p>
-            <w:pPr>
-              <w:spacing w:after="0" w:line="240" w:lineRule="auto"/>
-              <w:rPr>
-                <w:rFonts w:ascii="Times New Roman" w:hAnsi="Times New Roman" w:cs="Times New Roman"/>
-                <w:sz w:val="24"/>
-                <w:szCs w:val="24"/>
-              </w:rPr>
-            </w:pPr>
-            <w:r>
-              <w:rPr>
-                <w:rFonts w:ascii="Times New Roman" w:hAnsi="Times New Roman" w:cs="Times New Roman"/>
-                <w:sz w:val="24"/>
-                <w:szCs w:val="24"/>
-              </w:rPr>
-              <w:t>System verifies me</w:t>
+            <w:shd w:val="clear"/>
+            <w:vAlign w:val="top"/>
+          </w:tcPr>
+          <w:p>
+            <w:pPr>
+              <w:spacing w:after="0" w:line="240" w:lineRule="auto"/>
+              <w:rPr>
+                <w:rFonts w:ascii="Times New Roman" w:hAnsi="Times New Roman" w:cs="Times New Roman" w:eastAsiaTheme="minorEastAsia"/>
+                <w:sz w:val="24"/>
+                <w:szCs w:val="24"/>
+                <w:lang w:val="en-US" w:eastAsia="zh-CN" w:bidi="ar-SA"/>
+              </w:rPr>
+            </w:pPr>
+            <w:r>
+              <w:rPr>
+                <w:rFonts w:ascii="Times New Roman" w:hAnsi="Times New Roman" w:cs="Times New Roman"/>
+                <w:sz w:val="24"/>
+                <w:szCs w:val="24"/>
+              </w:rPr>
+              <w:t xml:space="preserve"> I can use the service</w:t>
             </w:r>
           </w:p>
         </w:tc>
         <w:tc>
           <w:tcPr>
             <w:tcW w:w="2696" w:type="dxa"/>
-          </w:tcPr>
-          <w:p>
-            <w:pPr>
-              <w:spacing w:after="0" w:line="240" w:lineRule="auto"/>
-              <w:rPr>
-                <w:rFonts w:ascii="Times New Roman" w:hAnsi="Times New Roman" w:cs="Times New Roman"/>
-                <w:sz w:val="24"/>
-                <w:szCs w:val="24"/>
-              </w:rPr>
-            </w:pPr>
-            <w:r>
-              <w:rPr>
-                <w:rFonts w:ascii="Times New Roman" w:hAnsi="Times New Roman" w:cs="Times New Roman"/>
-                <w:sz w:val="24"/>
-                <w:szCs w:val="24"/>
-              </w:rPr>
-              <w:t>Successful login opens</w:t>
-            </w:r>
-          </w:p>
-          <w:p>
-            <w:pPr>
-              <w:spacing w:after="0" w:line="240" w:lineRule="auto"/>
-              <w:rPr>
-                <w:rFonts w:ascii="Times New Roman" w:hAnsi="Times New Roman" w:cs="Times New Roman"/>
-                <w:sz w:val="24"/>
-                <w:szCs w:val="24"/>
-              </w:rPr>
-            </w:pPr>
-            <w:r>
-              <w:rPr>
-                <w:rFonts w:ascii="Times New Roman" w:hAnsi="Times New Roman" w:cs="Times New Roman"/>
-                <w:sz w:val="24"/>
-                <w:szCs w:val="24"/>
-              </w:rPr>
-              <w:t>homepage</w:t>
+            <w:shd w:val="clear"/>
+            <w:vAlign w:val="top"/>
+          </w:tcPr>
+          <w:p>
+            <w:pPr>
+              <w:spacing w:after="0" w:line="240" w:lineRule="auto"/>
+              <w:rPr>
+                <w:rFonts w:ascii="Times New Roman" w:hAnsi="Times New Roman" w:cs="Times New Roman" w:eastAsiaTheme="minorEastAsia"/>
+                <w:sz w:val="24"/>
+                <w:szCs w:val="24"/>
+                <w:lang w:val="en-US" w:eastAsia="zh-CN" w:bidi="ar-SA"/>
+              </w:rPr>
+            </w:pPr>
+            <w:r>
+              <w:rPr>
+                <w:rFonts w:ascii="Times New Roman" w:hAnsi="Times New Roman" w:cs="Times New Roman"/>
+                <w:sz w:val="24"/>
+                <w:szCs w:val="24"/>
+              </w:rPr>
+              <w:t>OTP sent to mobile/email for verification</w:t>
             </w:r>
           </w:p>
         </w:tc>
@@ -754,6 +792,7 @@
           <w:tcPr>
             <w:tcW w:w="2337" w:type="dxa"/>
             <w:vMerge w:val="continue"/>
+            <w:tcBorders/>
           </w:tcPr>
           <w:p>
             <w:pPr>
@@ -769,105 +808,162 @@
         <w:tc>
           <w:tcPr>
             <w:tcW w:w="2337" w:type="dxa"/>
-          </w:tcPr>
-          <w:p>
-            <w:pPr>
-              <w:spacing w:after="0" w:line="240" w:lineRule="auto"/>
-              <w:rPr>
-                <w:rFonts w:ascii="Times New Roman" w:hAnsi="Times New Roman" w:cs="Times New Roman"/>
-                <w:sz w:val="24"/>
-                <w:szCs w:val="24"/>
-              </w:rPr>
-            </w:pPr>
-            <w:r>
-              <w:rPr>
-                <w:rFonts w:ascii="Times New Roman" w:hAnsi="Times New Roman" w:cs="Times New Roman"/>
-                <w:sz w:val="24"/>
-                <w:szCs w:val="24"/>
-              </w:rPr>
-              <w:t>Book a helicopter</w:t>
-            </w:r>
-          </w:p>
-          <w:p>
-            <w:pPr>
-              <w:spacing w:after="0" w:line="240" w:lineRule="auto"/>
-              <w:rPr>
-                <w:rFonts w:ascii="Times New Roman" w:hAnsi="Times New Roman" w:cs="Times New Roman"/>
-                <w:sz w:val="24"/>
-                <w:szCs w:val="24"/>
-              </w:rPr>
-            </w:pPr>
-            <w:r>
-              <w:rPr>
-                <w:rFonts w:ascii="Times New Roman" w:hAnsi="Times New Roman" w:cs="Times New Roman"/>
-                <w:sz w:val="24"/>
-                <w:szCs w:val="24"/>
-              </w:rPr>
-              <w:t>ride</w:t>
+            <w:shd w:val="clear"/>
+            <w:vAlign w:val="top"/>
+          </w:tcPr>
+          <w:p>
+            <w:pPr>
+              <w:spacing w:after="0" w:line="240" w:lineRule="auto"/>
+              <w:rPr>
+                <w:rFonts w:ascii="Times New Roman" w:hAnsi="Times New Roman" w:cs="Times New Roman" w:eastAsiaTheme="minorEastAsia"/>
+                <w:sz w:val="24"/>
+                <w:szCs w:val="24"/>
+                <w:lang w:val="en-US" w:eastAsia="zh-CN" w:bidi="ar-SA"/>
+              </w:rPr>
+            </w:pPr>
+            <w:r>
+              <w:rPr>
+                <w:sz w:val="24"/>
+              </w:rPr>
+              <mc:AlternateContent>
+                <mc:Choice Requires="wps">
+                  <w:drawing>
+                    <wp:anchor distT="0" distB="0" distL="114300" distR="114300" simplePos="0" relativeHeight="251663360" behindDoc="0" locked="0" layoutInCell="1" allowOverlap="1">
+                      <wp:simplePos x="0" y="0"/>
+                      <wp:positionH relativeFrom="column">
+                        <wp:posOffset>-1600200</wp:posOffset>
+                      </wp:positionH>
+                      <wp:positionV relativeFrom="paragraph">
+                        <wp:posOffset>-635</wp:posOffset>
+                      </wp:positionV>
+                      <wp:extent cx="1543050" cy="0"/>
+                      <wp:effectExtent l="0" t="6350" r="0" b="6350"/>
+                      <wp:wrapNone/>
+                      <wp:docPr id="2" name="Straight Connector 2"/>
+                      <wp:cNvGraphicFramePr/>
+                      <a:graphic xmlns:a="http://schemas.openxmlformats.org/drawingml/2006/main">
+                        <a:graphicData uri="http://schemas.microsoft.com/office/word/2010/wordprocessingShape">
+                          <wps:wsp>
+                            <wps:cNvCnPr/>
+                            <wps:spPr>
+                              <a:xfrm flipH="1">
+                                <a:off x="1765935" y="1451610"/>
+                                <a:ext cx="1543050" cy="0"/>
+                              </a:xfrm>
+                              <a:prstGeom prst="line">
+                                <a:avLst/>
+                              </a:prstGeom>
+                            </wps:spPr>
+                            <wps:style>
+                              <a:lnRef idx="2">
+                                <a:schemeClr val="accent1"/>
+                              </a:lnRef>
+                              <a:fillRef idx="0">
+                                <a:srgbClr val="FFFFFF"/>
+                              </a:fillRef>
+                              <a:effectRef idx="0">
+                                <a:srgbClr val="FFFFFF"/>
+                              </a:effectRef>
+                              <a:fontRef idx="minor">
+                                <a:schemeClr val="tx1"/>
+                              </a:fontRef>
+                            </wps:style>
+                            <wps:bodyPr/>
+                          </wps:wsp>
+                        </a:graphicData>
+                      </a:graphic>
+                    </wp:anchor>
+                  </w:drawing>
+                </mc:Choice>
+                <mc:Fallback>
+                  <w:pict>
+                    <v:line id="_x0000_s1026" o:spid="_x0000_s1026" o:spt="20" style="position:absolute;left:0pt;flip:x;margin-left:-126pt;margin-top:-0.05pt;height:0pt;width:121.5pt;z-index:251663360;mso-width-relative:page;mso-height-relative:page;" filled="f" stroked="t" coordsize="21600,21600" o:gfxdata="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">
+                      <v:fill on="f" focussize="0,0"/>
+                      <v:stroke weight="1pt" color="#5B9BD5 [3204]" miterlimit="8" joinstyle="miter"/>
+                      <v:imagedata o:title=""/>
+                      <o:lock v:ext="edit" aspectratio="f"/>
+                    </v:line>
+                  </w:pict>
+                </mc:Fallback>
+              </mc:AlternateContent>
+            </w:r>
+            <w:r>
+              <w:rPr>
+                <w:rFonts w:ascii="Times New Roman" w:hAnsi="Times New Roman" w:cs="Times New Roman"/>
+                <w:sz w:val="24"/>
+                <w:szCs w:val="24"/>
+              </w:rPr>
+              <w:t>Login</w:t>
             </w:r>
           </w:p>
         </w:tc>
         <w:tc>
           <w:tcPr>
             <w:tcW w:w="2338" w:type="dxa"/>
-          </w:tcPr>
-          <w:p>
-            <w:pPr>
-              <w:spacing w:after="0" w:line="240" w:lineRule="auto"/>
-              <w:rPr>
-                <w:rFonts w:ascii="Times New Roman" w:hAnsi="Times New Roman" w:cs="Times New Roman"/>
-                <w:sz w:val="24"/>
-                <w:szCs w:val="24"/>
-              </w:rPr>
-            </w:pPr>
-            <w:r>
-              <w:rPr>
-                <w:rFonts w:ascii="Times New Roman" w:hAnsi="Times New Roman" w:cs="Times New Roman"/>
-                <w:sz w:val="24"/>
-                <w:szCs w:val="24"/>
-              </w:rPr>
-              <w:t>I can travel quickly</w:t>
+            <w:shd w:val="clear"/>
+            <w:vAlign w:val="top"/>
+          </w:tcPr>
+          <w:p>
+            <w:pPr>
+              <w:spacing w:after="0" w:line="240" w:lineRule="auto"/>
+              <w:rPr>
+                <w:rFonts w:ascii="Times New Roman" w:hAnsi="Times New Roman" w:cs="Times New Roman" w:eastAsiaTheme="minorEastAsia"/>
+                <w:sz w:val="24"/>
+                <w:szCs w:val="24"/>
+                <w:lang w:val="en-US" w:eastAsia="zh-CN" w:bidi="ar-SA"/>
+              </w:rPr>
+            </w:pPr>
+            <w:r>
+              <w:rPr>
+                <w:rFonts w:ascii="Times New Roman" w:hAnsi="Times New Roman" w:cs="Times New Roman"/>
+                <w:sz w:val="24"/>
+                <w:szCs w:val="24"/>
+              </w:rPr>
+              <w:t>System verifies me</w:t>
             </w:r>
           </w:p>
         </w:tc>
         <w:tc>
           <w:tcPr>
             <w:tcW w:w="2696" w:type="dxa"/>
-          </w:tcPr>
-          <w:p>
-            <w:pPr>
-              <w:spacing w:after="0" w:line="240" w:lineRule="auto"/>
-              <w:rPr>
-                <w:rFonts w:ascii="Times New Roman" w:hAnsi="Times New Roman" w:cs="Times New Roman"/>
-                <w:sz w:val="24"/>
-                <w:szCs w:val="24"/>
-              </w:rPr>
-            </w:pPr>
-            <w:r>
-              <w:rPr>
-                <w:rFonts w:ascii="Times New Roman" w:hAnsi="Times New Roman" w:cs="Times New Roman"/>
-                <w:sz w:val="24"/>
-                <w:szCs w:val="24"/>
-              </w:rPr>
-              <w:t>Booking confirmation via</w:t>
-            </w:r>
-          </w:p>
-          <w:p>
-            <w:pPr>
-              <w:spacing w:after="0" w:line="240" w:lineRule="auto"/>
-              <w:rPr>
-                <w:rFonts w:ascii="Times New Roman" w:hAnsi="Times New Roman" w:cs="Times New Roman"/>
-                <w:sz w:val="24"/>
-                <w:szCs w:val="24"/>
-              </w:rPr>
-            </w:pPr>
-            <w:r>
-              <w:rPr>
-                <w:rFonts w:ascii="Times New Roman" w:hAnsi="Times New Roman" w:cs="Times New Roman"/>
-                <w:sz w:val="24"/>
-                <w:szCs w:val="24"/>
-              </w:rPr>
-              <w:t>SMS &amp; app</w:t>
+            <w:shd w:val="clear"/>
+            <w:vAlign w:val="top"/>
+          </w:tcPr>
+          <w:p>
+            <w:pPr>
+              <w:spacing w:after="0" w:line="240" w:lineRule="auto"/>
+              <w:rPr>
+                <w:rFonts w:ascii="Times New Roman" w:hAnsi="Times New Roman" w:cs="Times New Roman"/>
+                <w:sz w:val="24"/>
+                <w:szCs w:val="24"/>
+              </w:rPr>
+            </w:pPr>
+            <w:r>
+              <w:rPr>
+                <w:rFonts w:ascii="Times New Roman" w:hAnsi="Times New Roman" w:cs="Times New Roman"/>
+                <w:sz w:val="24"/>
+                <w:szCs w:val="24"/>
+              </w:rPr>
+              <w:t>Successful login opens</w:t>
+            </w:r>
+          </w:p>
+          <w:p>
+            <w:pPr>
+              <w:spacing w:after="0" w:line="240" w:lineRule="auto"/>
+              <w:rPr>
+                <w:rFonts w:ascii="Times New Roman" w:hAnsi="Times New Roman" w:cs="Times New Roman" w:eastAsiaTheme="minorEastAsia"/>
+                <w:sz w:val="24"/>
+                <w:szCs w:val="24"/>
+                <w:lang w:val="en-US" w:eastAsia="zh-CN" w:bidi="ar-SA"/>
+              </w:rPr>
+            </w:pPr>
+            <w:r>
+              <w:rPr>
+                <w:rFonts w:ascii="Times New Roman" w:hAnsi="Times New Roman" w:cs="Times New Roman"/>
+                <w:sz w:val="24"/>
+                <w:szCs w:val="24"/>
+              </w:rPr>
+              <w:t>homepage</w:t>
             </w:r>
           </w:p>
         </w:tc>
@@ -893,6 +989,7 @@
           <w:tcPr>
             <w:tcW w:w="2337" w:type="dxa"/>
             <w:vMerge w:val="continue"/>
+            <w:tcBorders/>
           </w:tcPr>
           <w:p>
             <w:pPr>
@@ -908,69 +1005,114 @@
         <w:tc>
           <w:tcPr>
             <w:tcW w:w="2337" w:type="dxa"/>
-          </w:tcPr>
-          <w:p>
-            <w:pPr>
-              <w:spacing w:after="0" w:line="240" w:lineRule="auto"/>
-              <w:rPr>
-                <w:rFonts w:ascii="Times New Roman" w:hAnsi="Times New Roman" w:cs="Times New Roman"/>
-                <w:sz w:val="24"/>
-                <w:szCs w:val="24"/>
-              </w:rPr>
-            </w:pPr>
-            <w:r>
-              <w:rPr>
-                <w:rFonts w:ascii="Times New Roman" w:hAnsi="Times New Roman" w:cs="Times New Roman"/>
-                <w:sz w:val="24"/>
-                <w:szCs w:val="24"/>
-              </w:rPr>
-              <w:t>View Flight Availability &amp; Select Seat</w:t>
+            <w:shd w:val="clear"/>
+            <w:vAlign w:val="top"/>
+          </w:tcPr>
+          <w:p>
+            <w:pPr>
+              <w:spacing w:after="0" w:line="240" w:lineRule="auto"/>
+              <w:rPr>
+                <w:rFonts w:ascii="Times New Roman" w:hAnsi="Times New Roman" w:cs="Times New Roman"/>
+                <w:sz w:val="24"/>
+                <w:szCs w:val="24"/>
+              </w:rPr>
+            </w:pPr>
+            <w:r>
+              <w:rPr>
+                <w:rFonts w:ascii="Times New Roman" w:hAnsi="Times New Roman" w:cs="Times New Roman"/>
+                <w:sz w:val="24"/>
+                <w:szCs w:val="24"/>
+              </w:rPr>
+              <w:t>Book a helicopter</w:t>
+            </w:r>
+          </w:p>
+          <w:p>
+            <w:pPr>
+              <w:spacing w:after="0" w:line="240" w:lineRule="auto"/>
+              <w:rPr>
+                <w:rFonts w:ascii="Times New Roman" w:hAnsi="Times New Roman" w:cs="Times New Roman" w:eastAsiaTheme="minorEastAsia"/>
+                <w:sz w:val="24"/>
+                <w:szCs w:val="24"/>
+                <w:lang w:val="en-US" w:eastAsia="zh-CN" w:bidi="ar-SA"/>
+              </w:rPr>
+            </w:pPr>
+            <w:r>
+              <w:rPr>
+                <w:rFonts w:ascii="Times New Roman" w:hAnsi="Times New Roman" w:cs="Times New Roman"/>
+                <w:sz w:val="24"/>
+                <w:szCs w:val="24"/>
+              </w:rPr>
+              <w:t>ride</w:t>
             </w:r>
           </w:p>
         </w:tc>
         <w:tc>
           <w:tcPr>
             <w:tcW w:w="2338" w:type="dxa"/>
-          </w:tcPr>
-          <w:p>
-            <w:pPr>
-              <w:spacing w:after="0" w:line="240" w:lineRule="auto"/>
-              <w:rPr>
-                <w:rFonts w:ascii="Times New Roman" w:hAnsi="Times New Roman" w:cs="Times New Roman"/>
-                <w:sz w:val="24"/>
-                <w:szCs w:val="24"/>
-              </w:rPr>
-            </w:pPr>
-            <w:r>
-              <w:rPr>
-                <w:rFonts w:ascii="Times New Roman" w:hAnsi="Times New Roman" w:cs="Times New Roman"/>
-                <w:sz w:val="24"/>
-                <w:szCs w:val="24"/>
-              </w:rPr>
-              <w:t>I can choose the most suitable flight and seat.</w:t>
+            <w:shd w:val="clear"/>
+            <w:vAlign w:val="top"/>
+          </w:tcPr>
+          <w:p>
+            <w:pPr>
+              <w:spacing w:after="0" w:line="240" w:lineRule="auto"/>
+              <w:rPr>
+                <w:rFonts w:ascii="Times New Roman" w:hAnsi="Times New Roman" w:cs="Times New Roman" w:eastAsiaTheme="minorEastAsia"/>
+                <w:sz w:val="24"/>
+                <w:szCs w:val="24"/>
+                <w:lang w:val="en-US" w:eastAsia="zh-CN" w:bidi="ar-SA"/>
+              </w:rPr>
+            </w:pPr>
+            <w:r>
+              <w:rPr>
+                <w:rFonts w:ascii="Times New Roman" w:hAnsi="Times New Roman" w:cs="Times New Roman"/>
+                <w:sz w:val="24"/>
+                <w:szCs w:val="24"/>
+              </w:rPr>
+              <w:t>I can travel quickly</w:t>
             </w:r>
           </w:p>
         </w:tc>
         <w:tc>
           <w:tcPr>
             <w:tcW w:w="2696" w:type="dxa"/>
-          </w:tcPr>
-          <w:p>
-            <w:pPr>
-              <w:spacing w:after="0" w:line="240" w:lineRule="auto"/>
-              <w:rPr>
-                <w:rFonts w:ascii="Times New Roman" w:hAnsi="Times New Roman" w:cs="Times New Roman"/>
-                <w:sz w:val="24"/>
-                <w:szCs w:val="24"/>
-              </w:rPr>
-            </w:pPr>
-            <w:r>
-              <w:rPr>
-                <w:rFonts w:ascii="Times New Roman" w:hAnsi="Times New Roman" w:cs="Times New Roman"/>
-                <w:sz w:val="24"/>
-                <w:szCs w:val="24"/>
-              </w:rPr>
-              <w:t>The system displays real-time flight availability and available seats for selection.</w:t>
+            <w:shd w:val="clear"/>
+            <w:vAlign w:val="top"/>
+          </w:tcPr>
+          <w:p>
+            <w:pPr>
+              <w:spacing w:after="0" w:line="240" w:lineRule="auto"/>
+              <w:rPr>
+                <w:rFonts w:ascii="Times New Roman" w:hAnsi="Times New Roman" w:cs="Times New Roman"/>
+                <w:sz w:val="24"/>
+                <w:szCs w:val="24"/>
+              </w:rPr>
+            </w:pPr>
+            <w:r>
+              <w:rPr>
+                <w:rFonts w:ascii="Times New Roman" w:hAnsi="Times New Roman" w:cs="Times New Roman"/>
+                <w:sz w:val="24"/>
+                <w:szCs w:val="24"/>
+              </w:rPr>
+              <w:t>Booking confirmation via</w:t>
+            </w:r>
+          </w:p>
+          <w:p>
+            <w:pPr>
+              <w:spacing w:after="0" w:line="240" w:lineRule="auto"/>
+              <w:rPr>
+                <w:rFonts w:ascii="Times New Roman" w:hAnsi="Times New Roman" w:cs="Times New Roman" w:eastAsiaTheme="minorEastAsia"/>
+                <w:sz w:val="24"/>
+                <w:szCs w:val="24"/>
+                <w:lang w:val="en-US" w:eastAsia="zh-CN" w:bidi="ar-SA"/>
+              </w:rPr>
+            </w:pPr>
+            <w:r>
+              <w:rPr>
+                <w:rFonts w:ascii="Times New Roman" w:hAnsi="Times New Roman" w:cs="Times New Roman"/>
+                <w:sz w:val="24"/>
+                <w:szCs w:val="24"/>
+              </w:rPr>
+              <w:t>SMS &amp; app</w:t>
             </w:r>
           </w:p>
         </w:tc>
@@ -996,6 +1138,7 @@
           <w:tcPr>
             <w:tcW w:w="2337" w:type="dxa"/>
             <w:vMerge w:val="continue"/>
+            <w:tcBorders/>
           </w:tcPr>
           <w:p>
             <w:pPr>
@@ -1011,87 +1154,78 @@
         <w:tc>
           <w:tcPr>
             <w:tcW w:w="2337" w:type="dxa"/>
-          </w:tcPr>
-          <w:p>
-            <w:pPr>
-              <w:spacing w:after="0" w:line="240" w:lineRule="auto"/>
-              <w:rPr>
-                <w:rFonts w:ascii="Times New Roman" w:hAnsi="Times New Roman" w:cs="Times New Roman"/>
-                <w:sz w:val="24"/>
-                <w:szCs w:val="24"/>
-              </w:rPr>
-            </w:pPr>
-            <w:r>
-              <w:rPr>
-                <w:rFonts w:ascii="Times New Roman" w:hAnsi="Times New Roman" w:cs="Times New Roman"/>
-                <w:sz w:val="24"/>
-                <w:szCs w:val="24"/>
-              </w:rPr>
-              <w:t>Make digital payment</w:t>
+            <w:shd w:val="clear"/>
+            <w:vAlign w:val="top"/>
+          </w:tcPr>
+          <w:p>
+            <w:pPr>
+              <w:spacing w:after="0" w:line="240" w:lineRule="auto"/>
+              <w:rPr>
+                <w:rFonts w:ascii="Times New Roman" w:hAnsi="Times New Roman" w:cs="Times New Roman" w:eastAsiaTheme="minorEastAsia"/>
+                <w:sz w:val="24"/>
+                <w:szCs w:val="24"/>
+                <w:lang w:val="en-US" w:eastAsia="zh-CN" w:bidi="ar-SA"/>
+              </w:rPr>
+            </w:pPr>
+            <w:r>
+              <w:rPr>
+                <w:rFonts w:ascii="Times New Roman" w:hAnsi="Times New Roman" w:cs="Times New Roman"/>
+                <w:sz w:val="24"/>
+                <w:szCs w:val="24"/>
+              </w:rPr>
+              <w:t>View Flight Availability &amp; Select Seat</w:t>
             </w:r>
           </w:p>
         </w:tc>
         <w:tc>
           <w:tcPr>
             <w:tcW w:w="2338" w:type="dxa"/>
-          </w:tcPr>
-          <w:p>
-            <w:pPr>
-              <w:spacing w:after="0" w:line="240" w:lineRule="auto"/>
-              <w:rPr>
-                <w:rFonts w:ascii="Times New Roman" w:hAnsi="Times New Roman" w:cs="Times New Roman"/>
-                <w:sz w:val="24"/>
-                <w:szCs w:val="24"/>
-              </w:rPr>
-            </w:pPr>
-            <w:r>
-              <w:rPr>
-                <w:rFonts w:ascii="Times New Roman" w:hAnsi="Times New Roman" w:cs="Times New Roman"/>
-                <w:sz w:val="24"/>
-                <w:szCs w:val="24"/>
-              </w:rPr>
-              <w:t>I can confirm my ride</w:t>
+            <w:shd w:val="clear"/>
+            <w:vAlign w:val="top"/>
+          </w:tcPr>
+          <w:p>
+            <w:pPr>
+              <w:spacing w:after="0" w:line="240" w:lineRule="auto"/>
+              <w:rPr>
+                <w:rFonts w:ascii="Times New Roman" w:hAnsi="Times New Roman" w:cs="Times New Roman" w:eastAsiaTheme="minorEastAsia"/>
+                <w:sz w:val="24"/>
+                <w:szCs w:val="24"/>
+                <w:lang w:val="en-US" w:eastAsia="zh-CN" w:bidi="ar-SA"/>
+              </w:rPr>
+            </w:pPr>
+            <w:r>
+              <w:rPr>
+                <w:rFonts w:ascii="Times New Roman" w:hAnsi="Times New Roman" w:cs="Times New Roman"/>
+                <w:sz w:val="24"/>
+                <w:szCs w:val="24"/>
+              </w:rPr>
+              <w:t>I can choose the most suitable flight and seat.</w:t>
             </w:r>
           </w:p>
         </w:tc>
         <w:tc>
           <w:tcPr>
             <w:tcW w:w="2696" w:type="dxa"/>
-          </w:tcPr>
-          <w:p>
-            <w:pPr>
-              <w:spacing w:after="0" w:line="240" w:lineRule="auto"/>
-              <w:rPr>
-                <w:rFonts w:ascii="Times New Roman" w:hAnsi="Times New Roman" w:cs="Times New Roman"/>
-                <w:sz w:val="24"/>
-                <w:szCs w:val="24"/>
-              </w:rPr>
-            </w:pPr>
-            <w:r>
-              <w:rPr>
-                <w:rFonts w:ascii="Times New Roman" w:hAnsi="Times New Roman" w:cs="Times New Roman"/>
-                <w:sz w:val="24"/>
-                <w:szCs w:val="24"/>
-              </w:rPr>
-              <w:t>Payment success</w:t>
-            </w:r>
-          </w:p>
-          <w:p>
-            <w:pPr>
-              <w:spacing w:after="0" w:line="240" w:lineRule="auto"/>
-              <w:rPr>
-                <w:rFonts w:ascii="Times New Roman" w:hAnsi="Times New Roman" w:cs="Times New Roman"/>
-                <w:sz w:val="24"/>
-                <w:szCs w:val="24"/>
-              </w:rPr>
-            </w:pPr>
-            <w:r>
-              <w:rPr>
-                <w:rFonts w:ascii="Times New Roman" w:hAnsi="Times New Roman" w:cs="Times New Roman"/>
-                <w:sz w:val="24"/>
-                <w:szCs w:val="24"/>
-              </w:rPr>
-              <w:t>message &amp; invoice shown</w:t>
+            <w:shd w:val="clear"/>
+            <w:vAlign w:val="top"/>
+          </w:tcPr>
+          <w:p>
+            <w:pPr>
+              <w:spacing w:after="0" w:line="240" w:lineRule="auto"/>
+              <w:rPr>
+                <w:rFonts w:ascii="Times New Roman" w:hAnsi="Times New Roman" w:cs="Times New Roman" w:eastAsiaTheme="minorEastAsia"/>
+                <w:sz w:val="24"/>
+                <w:szCs w:val="24"/>
+                <w:lang w:val="en-US" w:eastAsia="zh-CN" w:bidi="ar-SA"/>
+              </w:rPr>
+            </w:pPr>
+            <w:r>
+              <w:rPr>
+                <w:rFonts w:ascii="Times New Roman" w:hAnsi="Times New Roman" w:cs="Times New Roman"/>
+                <w:sz w:val="24"/>
+                <w:szCs w:val="24"/>
+              </w:rPr>
+              <w:t>The system displays real-time flight availability and available seats for selection.</w:t>
             </w:r>
           </w:p>
         </w:tc>
@@ -1117,6 +1251,7 @@
           <w:tcPr>
             <w:tcW w:w="2337" w:type="dxa"/>
             <w:vMerge w:val="continue"/>
+            <w:tcBorders/>
           </w:tcPr>
           <w:p>
             <w:pPr>
@@ -1132,69 +1267,96 @@
         <w:tc>
           <w:tcPr>
             <w:tcW w:w="2337" w:type="dxa"/>
-          </w:tcPr>
-          <w:p>
-            <w:pPr>
-              <w:spacing w:after="0" w:line="240" w:lineRule="auto"/>
-              <w:rPr>
-                <w:rFonts w:ascii="Times New Roman" w:hAnsi="Times New Roman" w:cs="Times New Roman"/>
-                <w:sz w:val="24"/>
-                <w:szCs w:val="24"/>
-              </w:rPr>
-            </w:pPr>
-            <w:r>
-              <w:rPr>
-                <w:rFonts w:ascii="Times New Roman" w:hAnsi="Times New Roman" w:cs="Times New Roman"/>
-                <w:sz w:val="24"/>
-                <w:szCs w:val="24"/>
-              </w:rPr>
-              <w:t>Track flight live</w:t>
+            <w:shd w:val="clear"/>
+            <w:vAlign w:val="top"/>
+          </w:tcPr>
+          <w:p>
+            <w:pPr>
+              <w:spacing w:after="0" w:line="240" w:lineRule="auto"/>
+              <w:rPr>
+                <w:rFonts w:ascii="Times New Roman" w:hAnsi="Times New Roman" w:cs="Times New Roman" w:eastAsiaTheme="minorEastAsia"/>
+                <w:sz w:val="24"/>
+                <w:szCs w:val="24"/>
+                <w:lang w:val="en-US" w:eastAsia="zh-CN" w:bidi="ar-SA"/>
+              </w:rPr>
+            </w:pPr>
+            <w:r>
+              <w:rPr>
+                <w:rFonts w:ascii="Times New Roman" w:hAnsi="Times New Roman" w:cs="Times New Roman"/>
+                <w:sz w:val="24"/>
+                <w:szCs w:val="24"/>
+              </w:rPr>
+              <w:t>Make digital payment</w:t>
             </w:r>
           </w:p>
         </w:tc>
         <w:tc>
           <w:tcPr>
             <w:tcW w:w="2338" w:type="dxa"/>
-          </w:tcPr>
-          <w:p>
-            <w:pPr>
-              <w:spacing w:after="0" w:line="240" w:lineRule="auto"/>
-              <w:rPr>
-                <w:rFonts w:ascii="Times New Roman" w:hAnsi="Times New Roman" w:cs="Times New Roman"/>
-                <w:sz w:val="24"/>
-                <w:szCs w:val="24"/>
-              </w:rPr>
-            </w:pPr>
-            <w:r>
-              <w:rPr>
-                <w:rFonts w:ascii="Times New Roman" w:hAnsi="Times New Roman" w:cs="Times New Roman"/>
-                <w:sz w:val="24"/>
-                <w:szCs w:val="24"/>
-              </w:rPr>
-              <w:t>I know the helicopter status</w:t>
+            <w:shd w:val="clear"/>
+            <w:vAlign w:val="top"/>
+          </w:tcPr>
+          <w:p>
+            <w:pPr>
+              <w:spacing w:after="0" w:line="240" w:lineRule="auto"/>
+              <w:rPr>
+                <w:rFonts w:ascii="Times New Roman" w:hAnsi="Times New Roman" w:cs="Times New Roman" w:eastAsiaTheme="minorEastAsia"/>
+                <w:sz w:val="24"/>
+                <w:szCs w:val="24"/>
+                <w:lang w:val="en-US" w:eastAsia="zh-CN" w:bidi="ar-SA"/>
+              </w:rPr>
+            </w:pPr>
+            <w:r>
+              <w:rPr>
+                <w:rFonts w:ascii="Times New Roman" w:hAnsi="Times New Roman" w:cs="Times New Roman"/>
+                <w:sz w:val="24"/>
+                <w:szCs w:val="24"/>
+              </w:rPr>
+              <w:t>I can confirm my ride</w:t>
             </w:r>
           </w:p>
         </w:tc>
         <w:tc>
           <w:tcPr>
             <w:tcW w:w="2696" w:type="dxa"/>
-          </w:tcPr>
-          <w:p>
-            <w:pPr>
-              <w:spacing w:after="0" w:line="240" w:lineRule="auto"/>
-              <w:rPr>
-                <w:rFonts w:ascii="Times New Roman" w:hAnsi="Times New Roman" w:cs="Times New Roman"/>
-                <w:sz w:val="24"/>
-                <w:szCs w:val="24"/>
-              </w:rPr>
-            </w:pPr>
-            <w:r>
-              <w:rPr>
-                <w:rFonts w:ascii="Times New Roman" w:hAnsi="Times New Roman" w:cs="Times New Roman"/>
-                <w:sz w:val="24"/>
-                <w:szCs w:val="24"/>
-              </w:rPr>
-              <w:t>Map shows real-time GPS</w:t>
+            <w:shd w:val="clear"/>
+            <w:vAlign w:val="top"/>
+          </w:tcPr>
+          <w:p>
+            <w:pPr>
+              <w:spacing w:after="0" w:line="240" w:lineRule="auto"/>
+              <w:rPr>
+                <w:rFonts w:ascii="Times New Roman" w:hAnsi="Times New Roman" w:cs="Times New Roman"/>
+                <w:sz w:val="24"/>
+                <w:szCs w:val="24"/>
+              </w:rPr>
+            </w:pPr>
+            <w:r>
+              <w:rPr>
+                <w:rFonts w:ascii="Times New Roman" w:hAnsi="Times New Roman" w:cs="Times New Roman"/>
+                <w:sz w:val="24"/>
+                <w:szCs w:val="24"/>
+              </w:rPr>
+              <w:t>Payment success</w:t>
+            </w:r>
+          </w:p>
+          <w:p>
+            <w:pPr>
+              <w:spacing w:after="0" w:line="240" w:lineRule="auto"/>
+              <w:rPr>
+                <w:rFonts w:ascii="Times New Roman" w:hAnsi="Times New Roman" w:cs="Times New Roman" w:eastAsiaTheme="minorEastAsia"/>
+                <w:sz w:val="24"/>
+                <w:szCs w:val="24"/>
+                <w:lang w:val="en-US" w:eastAsia="zh-CN" w:bidi="ar-SA"/>
+              </w:rPr>
+            </w:pPr>
+            <w:r>
+              <w:rPr>
+                <w:rFonts w:ascii="Times New Roman" w:hAnsi="Times New Roman" w:cs="Times New Roman"/>
+                <w:sz w:val="24"/>
+                <w:szCs w:val="24"/>
+              </w:rPr>
+              <w:t>message &amp; invoice shown</w:t>
             </w:r>
           </w:p>
         </w:tc>
@@ -1220,6 +1382,7 @@
           <w:tcPr>
             <w:tcW w:w="2337" w:type="dxa"/>
             <w:vMerge w:val="continue"/>
+            <w:tcBorders/>
           </w:tcPr>
           <w:p>
             <w:pPr>
@@ -1235,69 +1398,78 @@
         <w:tc>
           <w:tcPr>
             <w:tcW w:w="2337" w:type="dxa"/>
-          </w:tcPr>
-          <w:p>
-            <w:pPr>
-              <w:spacing w:after="0" w:line="240" w:lineRule="auto"/>
-              <w:rPr>
-                <w:rFonts w:ascii="Times New Roman" w:hAnsi="Times New Roman" w:cs="Times New Roman"/>
-                <w:sz w:val="24"/>
-                <w:szCs w:val="24"/>
-              </w:rPr>
-            </w:pPr>
-            <w:r>
-              <w:rPr>
-                <w:rFonts w:ascii="Times New Roman" w:hAnsi="Times New Roman" w:cs="Times New Roman"/>
-                <w:sz w:val="24"/>
-                <w:szCs w:val="24"/>
-              </w:rPr>
-              <w:t>Modify or cancel booking</w:t>
+            <w:shd w:val="clear"/>
+            <w:vAlign w:val="top"/>
+          </w:tcPr>
+          <w:p>
+            <w:pPr>
+              <w:spacing w:after="0" w:line="240" w:lineRule="auto"/>
+              <w:rPr>
+                <w:rFonts w:ascii="Times New Roman" w:hAnsi="Times New Roman" w:cs="Times New Roman" w:eastAsiaTheme="minorEastAsia"/>
+                <w:sz w:val="24"/>
+                <w:szCs w:val="24"/>
+                <w:lang w:val="en-US" w:eastAsia="zh-CN" w:bidi="ar-SA"/>
+              </w:rPr>
+            </w:pPr>
+            <w:r>
+              <w:rPr>
+                <w:rFonts w:ascii="Times New Roman" w:hAnsi="Times New Roman" w:cs="Times New Roman"/>
+                <w:sz w:val="24"/>
+                <w:szCs w:val="24"/>
+              </w:rPr>
+              <w:t>Track flight live</w:t>
             </w:r>
           </w:p>
         </w:tc>
         <w:tc>
           <w:tcPr>
             <w:tcW w:w="2338" w:type="dxa"/>
-          </w:tcPr>
-          <w:p>
-            <w:pPr>
-              <w:spacing w:after="0" w:line="240" w:lineRule="auto"/>
-              <w:rPr>
-                <w:rFonts w:ascii="Times New Roman" w:hAnsi="Times New Roman" w:cs="Times New Roman"/>
-                <w:sz w:val="24"/>
-                <w:szCs w:val="24"/>
-              </w:rPr>
-            </w:pPr>
-            <w:r>
-              <w:rPr>
-                <w:rFonts w:ascii="Times New Roman" w:hAnsi="Times New Roman" w:cs="Times New Roman"/>
-                <w:sz w:val="24"/>
-                <w:szCs w:val="24"/>
-              </w:rPr>
-              <w:t>Plans may change</w:t>
+            <w:shd w:val="clear"/>
+            <w:vAlign w:val="top"/>
+          </w:tcPr>
+          <w:p>
+            <w:pPr>
+              <w:spacing w:after="0" w:line="240" w:lineRule="auto"/>
+              <w:rPr>
+                <w:rFonts w:ascii="Times New Roman" w:hAnsi="Times New Roman" w:cs="Times New Roman" w:eastAsiaTheme="minorEastAsia"/>
+                <w:sz w:val="24"/>
+                <w:szCs w:val="24"/>
+                <w:lang w:val="en-US" w:eastAsia="zh-CN" w:bidi="ar-SA"/>
+              </w:rPr>
+            </w:pPr>
+            <w:r>
+              <w:rPr>
+                <w:rFonts w:ascii="Times New Roman" w:hAnsi="Times New Roman" w:cs="Times New Roman"/>
+                <w:sz w:val="24"/>
+                <w:szCs w:val="24"/>
+              </w:rPr>
+              <w:t>I know the helicopter status</w:t>
             </w:r>
           </w:p>
         </w:tc>
         <w:tc>
           <w:tcPr>
             <w:tcW w:w="2696" w:type="dxa"/>
-          </w:tcPr>
-          <w:p>
-            <w:pPr>
-              <w:spacing w:after="0" w:line="240" w:lineRule="auto"/>
-              <w:rPr>
-                <w:rFonts w:ascii="Times New Roman" w:hAnsi="Times New Roman" w:cs="Times New Roman"/>
-                <w:sz w:val="24"/>
-                <w:szCs w:val="24"/>
-              </w:rPr>
-            </w:pPr>
-            <w:r>
-              <w:rPr>
-                <w:rFonts w:ascii="Times New Roman" w:hAnsi="Times New Roman" w:cs="Times New Roman"/>
-                <w:sz w:val="24"/>
-                <w:szCs w:val="24"/>
-              </w:rPr>
-              <w:t>Refund processed automatically as per rules</w:t>
+            <w:shd w:val="clear"/>
+            <w:vAlign w:val="top"/>
+          </w:tcPr>
+          <w:p>
+            <w:pPr>
+              <w:spacing w:after="0" w:line="240" w:lineRule="auto"/>
+              <w:rPr>
+                <w:rFonts w:ascii="Times New Roman" w:hAnsi="Times New Roman" w:cs="Times New Roman" w:eastAsiaTheme="minorEastAsia"/>
+                <w:sz w:val="24"/>
+                <w:szCs w:val="24"/>
+                <w:lang w:val="en-US" w:eastAsia="zh-CN" w:bidi="ar-SA"/>
+              </w:rPr>
+            </w:pPr>
+            <w:r>
+              <w:rPr>
+                <w:rFonts w:ascii="Times New Roman" w:hAnsi="Times New Roman" w:cs="Times New Roman"/>
+                <w:sz w:val="24"/>
+                <w:szCs w:val="24"/>
+              </w:rPr>
+              <w:t>Map shows real-time GPS</w:t>
             </w:r>
           </w:p>
         </w:tc>
@@ -1323,6 +1495,7 @@
           <w:tcPr>
             <w:tcW w:w="2337" w:type="dxa"/>
             <w:vMerge w:val="continue"/>
+            <w:tcBorders/>
           </w:tcPr>
           <w:p>
             <w:pPr>
@@ -1338,69 +1511,78 @@
         <w:tc>
           <w:tcPr>
             <w:tcW w:w="2337" w:type="dxa"/>
-          </w:tcPr>
-          <w:p>
-            <w:pPr>
-              <w:spacing w:after="0" w:line="240" w:lineRule="auto"/>
-              <w:rPr>
-                <w:rFonts w:ascii="Times New Roman" w:hAnsi="Times New Roman" w:cs="Times New Roman"/>
-                <w:sz w:val="24"/>
-                <w:szCs w:val="24"/>
-              </w:rPr>
-            </w:pPr>
-            <w:r>
-              <w:rPr>
-                <w:rFonts w:ascii="Times New Roman" w:hAnsi="Times New Roman" w:cs="Times New Roman"/>
-                <w:sz w:val="24"/>
-                <w:szCs w:val="24"/>
-              </w:rPr>
-              <w:t>Request for an emergency ride</w:t>
+            <w:shd w:val="clear"/>
+            <w:vAlign w:val="top"/>
+          </w:tcPr>
+          <w:p>
+            <w:pPr>
+              <w:spacing w:after="0" w:line="240" w:lineRule="auto"/>
+              <w:rPr>
+                <w:rFonts w:ascii="Times New Roman" w:hAnsi="Times New Roman" w:cs="Times New Roman" w:eastAsiaTheme="minorEastAsia"/>
+                <w:sz w:val="24"/>
+                <w:szCs w:val="24"/>
+                <w:lang w:val="en-US" w:eastAsia="zh-CN" w:bidi="ar-SA"/>
+              </w:rPr>
+            </w:pPr>
+            <w:r>
+              <w:rPr>
+                <w:rFonts w:ascii="Times New Roman" w:hAnsi="Times New Roman" w:cs="Times New Roman"/>
+                <w:sz w:val="24"/>
+                <w:szCs w:val="24"/>
+              </w:rPr>
+              <w:t>Modify or cancel booking</w:t>
             </w:r>
           </w:p>
         </w:tc>
         <w:tc>
           <w:tcPr>
             <w:tcW w:w="2338" w:type="dxa"/>
-          </w:tcPr>
-          <w:p>
-            <w:pPr>
-              <w:spacing w:after="0" w:line="240" w:lineRule="auto"/>
-              <w:rPr>
-                <w:rFonts w:ascii="Times New Roman" w:hAnsi="Times New Roman" w:cs="Times New Roman"/>
-                <w:sz w:val="24"/>
-                <w:szCs w:val="24"/>
-              </w:rPr>
-            </w:pPr>
-            <w:r>
-              <w:rPr>
-                <w:rFonts w:ascii="Times New Roman" w:hAnsi="Times New Roman" w:cs="Times New Roman"/>
-                <w:sz w:val="24"/>
-                <w:szCs w:val="24"/>
-              </w:rPr>
-              <w:t>I can get urgent transport</w:t>
+            <w:shd w:val="clear"/>
+            <w:vAlign w:val="top"/>
+          </w:tcPr>
+          <w:p>
+            <w:pPr>
+              <w:spacing w:after="0" w:line="240" w:lineRule="auto"/>
+              <w:rPr>
+                <w:rFonts w:ascii="Times New Roman" w:hAnsi="Times New Roman" w:cs="Times New Roman" w:eastAsiaTheme="minorEastAsia"/>
+                <w:sz w:val="24"/>
+                <w:szCs w:val="24"/>
+                <w:lang w:val="en-US" w:eastAsia="zh-CN" w:bidi="ar-SA"/>
+              </w:rPr>
+            </w:pPr>
+            <w:r>
+              <w:rPr>
+                <w:rFonts w:ascii="Times New Roman" w:hAnsi="Times New Roman" w:cs="Times New Roman"/>
+                <w:sz w:val="24"/>
+                <w:szCs w:val="24"/>
+              </w:rPr>
+              <w:t>Plans may change</w:t>
             </w:r>
           </w:p>
         </w:tc>
         <w:tc>
           <w:tcPr>
             <w:tcW w:w="2696" w:type="dxa"/>
-          </w:tcPr>
-          <w:p>
-            <w:pPr>
-              <w:spacing w:after="0" w:line="240" w:lineRule="auto"/>
-              <w:rPr>
-                <w:rFonts w:ascii="Times New Roman" w:hAnsi="Times New Roman" w:cs="Times New Roman"/>
-                <w:sz w:val="24"/>
-                <w:szCs w:val="24"/>
-              </w:rPr>
-            </w:pPr>
-            <w:r>
-              <w:rPr>
-                <w:rFonts w:ascii="Times New Roman" w:hAnsi="Times New Roman" w:cs="Times New Roman"/>
-                <w:sz w:val="24"/>
-                <w:szCs w:val="24"/>
-              </w:rPr>
-              <w:t>Immediate booking confirmation</w:t>
+            <w:shd w:val="clear"/>
+            <w:vAlign w:val="top"/>
+          </w:tcPr>
+          <w:p>
+            <w:pPr>
+              <w:spacing w:after="0" w:line="240" w:lineRule="auto"/>
+              <w:rPr>
+                <w:rFonts w:ascii="Times New Roman" w:hAnsi="Times New Roman" w:cs="Times New Roman" w:eastAsiaTheme="minorEastAsia"/>
+                <w:sz w:val="24"/>
+                <w:szCs w:val="24"/>
+                <w:lang w:val="en-US" w:eastAsia="zh-CN" w:bidi="ar-SA"/>
+              </w:rPr>
+            </w:pPr>
+            <w:r>
+              <w:rPr>
+                <w:rFonts w:ascii="Times New Roman" w:hAnsi="Times New Roman" w:cs="Times New Roman"/>
+                <w:sz w:val="24"/>
+                <w:szCs w:val="24"/>
+              </w:rPr>
+              <w:t>Refund processed automatically as per rules</w:t>
             </w:r>
           </w:p>
         </w:tc>
@@ -1426,6 +1608,7 @@
           <w:tcPr>
             <w:tcW w:w="2337" w:type="dxa"/>
             <w:vMerge w:val="continue"/>
+            <w:tcBorders/>
           </w:tcPr>
           <w:p>
             <w:pPr>
@@ -1441,69 +1624,78 @@
         <w:tc>
           <w:tcPr>
             <w:tcW w:w="2337" w:type="dxa"/>
-          </w:tcPr>
-          <w:p>
-            <w:pPr>
-              <w:spacing w:after="0" w:line="240" w:lineRule="auto"/>
-              <w:rPr>
-                <w:rFonts w:ascii="Times New Roman" w:hAnsi="Times New Roman" w:cs="Times New Roman"/>
-                <w:sz w:val="24"/>
-                <w:szCs w:val="24"/>
-              </w:rPr>
-            </w:pPr>
-            <w:r>
-              <w:rPr>
-                <w:rFonts w:ascii="Times New Roman" w:hAnsi="Times New Roman" w:cs="Times New Roman"/>
-                <w:sz w:val="24"/>
-                <w:szCs w:val="24"/>
-              </w:rPr>
-              <w:t>Submit special requirements</w:t>
+            <w:shd w:val="clear"/>
+            <w:vAlign w:val="top"/>
+          </w:tcPr>
+          <w:p>
+            <w:pPr>
+              <w:spacing w:after="0" w:line="240" w:lineRule="auto"/>
+              <w:rPr>
+                <w:rFonts w:ascii="Times New Roman" w:hAnsi="Times New Roman" w:cs="Times New Roman" w:eastAsiaTheme="minorEastAsia"/>
+                <w:sz w:val="24"/>
+                <w:szCs w:val="24"/>
+                <w:lang w:val="en-US" w:eastAsia="zh-CN" w:bidi="ar-SA"/>
+              </w:rPr>
+            </w:pPr>
+            <w:r>
+              <w:rPr>
+                <w:rFonts w:ascii="Times New Roman" w:hAnsi="Times New Roman" w:cs="Times New Roman"/>
+                <w:sz w:val="24"/>
+                <w:szCs w:val="24"/>
+              </w:rPr>
+              <w:t>Request for an emergency ride</w:t>
             </w:r>
           </w:p>
         </w:tc>
         <w:tc>
           <w:tcPr>
             <w:tcW w:w="2338" w:type="dxa"/>
-          </w:tcPr>
-          <w:p>
-            <w:pPr>
-              <w:spacing w:after="0" w:line="240" w:lineRule="auto"/>
-              <w:rPr>
-                <w:rFonts w:ascii="Times New Roman" w:hAnsi="Times New Roman" w:cs="Times New Roman"/>
-                <w:sz w:val="24"/>
-                <w:szCs w:val="24"/>
-              </w:rPr>
-            </w:pPr>
-            <w:r>
-              <w:rPr>
-                <w:rFonts w:ascii="Times New Roman" w:hAnsi="Times New Roman" w:cs="Times New Roman"/>
-                <w:sz w:val="24"/>
-                <w:szCs w:val="24"/>
-              </w:rPr>
-              <w:t>Operator knows my needs</w:t>
+            <w:shd w:val="clear"/>
+            <w:vAlign w:val="top"/>
+          </w:tcPr>
+          <w:p>
+            <w:pPr>
+              <w:spacing w:after="0" w:line="240" w:lineRule="auto"/>
+              <w:rPr>
+                <w:rFonts w:ascii="Times New Roman" w:hAnsi="Times New Roman" w:cs="Times New Roman" w:eastAsiaTheme="minorEastAsia"/>
+                <w:sz w:val="24"/>
+                <w:szCs w:val="24"/>
+                <w:lang w:val="en-US" w:eastAsia="zh-CN" w:bidi="ar-SA"/>
+              </w:rPr>
+            </w:pPr>
+            <w:r>
+              <w:rPr>
+                <w:rFonts w:ascii="Times New Roman" w:hAnsi="Times New Roman" w:cs="Times New Roman"/>
+                <w:sz w:val="24"/>
+                <w:szCs w:val="24"/>
+              </w:rPr>
+              <w:t>I can get urgent transport</w:t>
             </w:r>
           </w:p>
         </w:tc>
         <w:tc>
           <w:tcPr>
             <w:tcW w:w="2696" w:type="dxa"/>
-          </w:tcPr>
-          <w:p>
-            <w:pPr>
-              <w:spacing w:after="0" w:line="240" w:lineRule="auto"/>
-              <w:rPr>
-                <w:rFonts w:ascii="Times New Roman" w:hAnsi="Times New Roman" w:cs="Times New Roman"/>
-                <w:sz w:val="24"/>
-                <w:szCs w:val="24"/>
-              </w:rPr>
-            </w:pPr>
-            <w:r>
-              <w:rPr>
-                <w:rFonts w:ascii="Times New Roman" w:hAnsi="Times New Roman" w:cs="Times New Roman"/>
-                <w:sz w:val="24"/>
-                <w:szCs w:val="24"/>
-              </w:rPr>
-              <w:t>Special request saved with booking</w:t>
+            <w:shd w:val="clear"/>
+            <w:vAlign w:val="top"/>
+          </w:tcPr>
+          <w:p>
+            <w:pPr>
+              <w:spacing w:after="0" w:line="240" w:lineRule="auto"/>
+              <w:rPr>
+                <w:rFonts w:ascii="Times New Roman" w:hAnsi="Times New Roman" w:cs="Times New Roman" w:eastAsiaTheme="minorEastAsia"/>
+                <w:sz w:val="24"/>
+                <w:szCs w:val="24"/>
+                <w:lang w:val="en-US" w:eastAsia="zh-CN" w:bidi="ar-SA"/>
+              </w:rPr>
+            </w:pPr>
+            <w:r>
+              <w:rPr>
+                <w:rFonts w:ascii="Times New Roman" w:hAnsi="Times New Roman" w:cs="Times New Roman"/>
+                <w:sz w:val="24"/>
+                <w:szCs w:val="24"/>
+              </w:rPr>
+              <w:t>Immediate booking confirmation</w:t>
             </w:r>
           </w:p>
         </w:tc>
@@ -1529,6 +1721,7 @@
           <w:tcPr>
             <w:tcW w:w="2337" w:type="dxa"/>
             <w:vMerge w:val="continue"/>
+            <w:tcBorders/>
           </w:tcPr>
           <w:p>
             <w:pPr>
@@ -1544,69 +1737,78 @@
         <w:tc>
           <w:tcPr>
             <w:tcW w:w="2337" w:type="dxa"/>
-          </w:tcPr>
-          <w:p>
-            <w:pPr>
-              <w:spacing w:after="0" w:line="240" w:lineRule="auto"/>
-              <w:rPr>
-                <w:rFonts w:ascii="Times New Roman" w:hAnsi="Times New Roman" w:cs="Times New Roman"/>
-                <w:sz w:val="24"/>
-                <w:szCs w:val="24"/>
-              </w:rPr>
-            </w:pPr>
-            <w:r>
-              <w:rPr>
-                <w:rFonts w:ascii="Times New Roman" w:hAnsi="Times New Roman" w:cs="Times New Roman"/>
-                <w:sz w:val="24"/>
-                <w:szCs w:val="24"/>
-              </w:rPr>
-              <w:t>Rate &amp; review service</w:t>
+            <w:shd w:val="clear"/>
+            <w:vAlign w:val="top"/>
+          </w:tcPr>
+          <w:p>
+            <w:pPr>
+              <w:spacing w:after="0" w:line="240" w:lineRule="auto"/>
+              <w:rPr>
+                <w:rFonts w:ascii="Times New Roman" w:hAnsi="Times New Roman" w:cs="Times New Roman" w:eastAsiaTheme="minorEastAsia"/>
+                <w:sz w:val="24"/>
+                <w:szCs w:val="24"/>
+                <w:lang w:val="en-US" w:eastAsia="zh-CN" w:bidi="ar-SA"/>
+              </w:rPr>
+            </w:pPr>
+            <w:r>
+              <w:rPr>
+                <w:rFonts w:ascii="Times New Roman" w:hAnsi="Times New Roman" w:cs="Times New Roman"/>
+                <w:sz w:val="24"/>
+                <w:szCs w:val="24"/>
+              </w:rPr>
+              <w:t>Submit special requirements</w:t>
             </w:r>
           </w:p>
         </w:tc>
         <w:tc>
           <w:tcPr>
             <w:tcW w:w="2338" w:type="dxa"/>
-          </w:tcPr>
-          <w:p>
-            <w:pPr>
-              <w:spacing w:after="0" w:line="240" w:lineRule="auto"/>
-              <w:rPr>
-                <w:rFonts w:ascii="Times New Roman" w:hAnsi="Times New Roman" w:cs="Times New Roman"/>
-                <w:sz w:val="24"/>
-                <w:szCs w:val="24"/>
-              </w:rPr>
-            </w:pPr>
-            <w:r>
-              <w:rPr>
-                <w:rFonts w:ascii="Times New Roman" w:hAnsi="Times New Roman" w:cs="Times New Roman"/>
-                <w:sz w:val="24"/>
-                <w:szCs w:val="24"/>
-              </w:rPr>
-              <w:t>Experience improves</w:t>
+            <w:shd w:val="clear"/>
+            <w:vAlign w:val="top"/>
+          </w:tcPr>
+          <w:p>
+            <w:pPr>
+              <w:spacing w:after="0" w:line="240" w:lineRule="auto"/>
+              <w:rPr>
+                <w:rFonts w:ascii="Times New Roman" w:hAnsi="Times New Roman" w:cs="Times New Roman" w:eastAsiaTheme="minorEastAsia"/>
+                <w:sz w:val="24"/>
+                <w:szCs w:val="24"/>
+                <w:lang w:val="en-US" w:eastAsia="zh-CN" w:bidi="ar-SA"/>
+              </w:rPr>
+            </w:pPr>
+            <w:r>
+              <w:rPr>
+                <w:rFonts w:ascii="Times New Roman" w:hAnsi="Times New Roman" w:cs="Times New Roman"/>
+                <w:sz w:val="24"/>
+                <w:szCs w:val="24"/>
+              </w:rPr>
+              <w:t>Operator knows my needs</w:t>
             </w:r>
           </w:p>
         </w:tc>
         <w:tc>
           <w:tcPr>
             <w:tcW w:w="2696" w:type="dxa"/>
-          </w:tcPr>
-          <w:p>
-            <w:pPr>
-              <w:spacing w:after="0" w:line="240" w:lineRule="auto"/>
-              <w:rPr>
-                <w:rFonts w:ascii="Times New Roman" w:hAnsi="Times New Roman" w:cs="Times New Roman"/>
-                <w:sz w:val="24"/>
-                <w:szCs w:val="24"/>
-              </w:rPr>
-            </w:pPr>
-            <w:r>
-              <w:rPr>
-                <w:rFonts w:ascii="Times New Roman" w:hAnsi="Times New Roman" w:cs="Times New Roman"/>
-                <w:sz w:val="24"/>
-                <w:szCs w:val="24"/>
-              </w:rPr>
-              <w:t>Rating stored in database</w:t>
+            <w:shd w:val="clear"/>
+            <w:vAlign w:val="top"/>
+          </w:tcPr>
+          <w:p>
+            <w:pPr>
+              <w:spacing w:after="0" w:line="240" w:lineRule="auto"/>
+              <w:rPr>
+                <w:rFonts w:ascii="Times New Roman" w:hAnsi="Times New Roman" w:cs="Times New Roman" w:eastAsiaTheme="minorEastAsia"/>
+                <w:sz w:val="24"/>
+                <w:szCs w:val="24"/>
+                <w:lang w:val="en-US" w:eastAsia="zh-CN" w:bidi="ar-SA"/>
+              </w:rPr>
+            </w:pPr>
+            <w:r>
+              <w:rPr>
+                <w:rFonts w:ascii="Times New Roman" w:hAnsi="Times New Roman" w:cs="Times New Roman"/>
+                <w:sz w:val="24"/>
+                <w:szCs w:val="24"/>
+              </w:rPr>
+              <w:t>Special request saved with booking</w:t>
             </w:r>
           </w:p>
         </w:tc>
@@ -1635,6 +1837,7 @@
           <w:tcPr>
             <w:tcW w:w="2337" w:type="dxa"/>
             <w:vMerge w:val="continue"/>
+            <w:tcBorders/>
           </w:tcPr>
           <w:p>
             <w:pPr>
@@ -1650,14 +1853,133 @@
         <w:tc>
           <w:tcPr>
             <w:tcW w:w="2337" w:type="dxa"/>
-          </w:tcPr>
-          <w:p>
-            <w:pPr>
-              <w:spacing w:after="0" w:line="240" w:lineRule="auto"/>
-              <w:rPr>
-                <w:rFonts w:ascii="Times New Roman" w:hAnsi="Times New Roman" w:cs="Times New Roman"/>
-                <w:sz w:val="24"/>
-                <w:szCs w:val="24"/>
+            <w:shd w:val="clear"/>
+            <w:vAlign w:val="top"/>
+          </w:tcPr>
+          <w:p>
+            <w:pPr>
+              <w:spacing w:after="0" w:line="240" w:lineRule="auto"/>
+              <w:rPr>
+                <w:rFonts w:ascii="Times New Roman" w:hAnsi="Times New Roman" w:cs="Times New Roman" w:eastAsiaTheme="minorEastAsia"/>
+                <w:sz w:val="24"/>
+                <w:szCs w:val="24"/>
+                <w:lang w:val="en-US" w:eastAsia="zh-CN" w:bidi="ar-SA"/>
+              </w:rPr>
+            </w:pPr>
+            <w:r>
+              <w:rPr>
+                <w:rFonts w:ascii="Times New Roman" w:hAnsi="Times New Roman" w:cs="Times New Roman"/>
+                <w:sz w:val="24"/>
+                <w:szCs w:val="24"/>
+              </w:rPr>
+              <w:t>Rate &amp; review service</w:t>
+            </w:r>
+          </w:p>
+        </w:tc>
+        <w:tc>
+          <w:tcPr>
+            <w:tcW w:w="2338" w:type="dxa"/>
+            <w:shd w:val="clear"/>
+            <w:vAlign w:val="top"/>
+          </w:tcPr>
+          <w:p>
+            <w:pPr>
+              <w:spacing w:after="0" w:line="240" w:lineRule="auto"/>
+              <w:rPr>
+                <w:rFonts w:ascii="Times New Roman" w:hAnsi="Times New Roman" w:cs="Times New Roman" w:eastAsiaTheme="minorEastAsia"/>
+                <w:sz w:val="24"/>
+                <w:szCs w:val="24"/>
+                <w:lang w:val="en-US" w:eastAsia="zh-CN" w:bidi="ar-SA"/>
+              </w:rPr>
+            </w:pPr>
+            <w:r>
+              <w:rPr>
+                <w:rFonts w:ascii="Times New Roman" w:hAnsi="Times New Roman" w:cs="Times New Roman"/>
+                <w:sz w:val="24"/>
+                <w:szCs w:val="24"/>
+              </w:rPr>
+              <w:t>Experience improves</w:t>
+            </w:r>
+          </w:p>
+        </w:tc>
+        <w:tc>
+          <w:tcPr>
+            <w:tcW w:w="2696" w:type="dxa"/>
+            <w:shd w:val="clear"/>
+            <w:vAlign w:val="top"/>
+          </w:tcPr>
+          <w:p>
+            <w:pPr>
+              <w:spacing w:after="0" w:line="240" w:lineRule="auto"/>
+              <w:rPr>
+                <w:rFonts w:ascii="Times New Roman" w:hAnsi="Times New Roman" w:cs="Times New Roman" w:eastAsiaTheme="minorEastAsia"/>
+                <w:sz w:val="24"/>
+                <w:szCs w:val="24"/>
+                <w:lang w:val="en-US" w:eastAsia="zh-CN" w:bidi="ar-SA"/>
+              </w:rPr>
+            </w:pPr>
+            <w:r>
+              <w:rPr>
+                <w:rFonts w:ascii="Times New Roman" w:hAnsi="Times New Roman" w:cs="Times New Roman"/>
+                <w:sz w:val="24"/>
+                <w:szCs w:val="24"/>
+              </w:rPr>
+              <w:t>Rating stored in database</w:t>
+            </w:r>
+          </w:p>
+        </w:tc>
+      </w:tr>
+      <w:tr>
+        <w:tblPrEx>
+          <w:tblBorders>
+            <w:top w:val="single" w:color="auto" w:sz="4" w:space="0"/>
+            <w:left w:val="single" w:color="auto" w:sz="4" w:space="0"/>
+            <w:bottom w:val="single" w:color="auto" w:sz="4" w:space="0"/>
+            <w:right w:val="single" w:color="auto" w:sz="4" w:space="0"/>
+            <w:insideH w:val="single" w:color="auto" w:sz="4" w:space="0"/>
+            <w:insideV w:val="single" w:color="auto" w:sz="4" w:space="0"/>
+          </w:tblBorders>
+          <w:tblCellMar>
+            <w:top w:w="0" w:type="dxa"/>
+            <w:left w:w="108" w:type="dxa"/>
+            <w:bottom w:w="0" w:type="dxa"/>
+            <w:right w:w="108" w:type="dxa"/>
+          </w:tblCellMar>
+        </w:tblPrEx>
+        <w:trPr>
+          <w:trHeight w:val="590" w:hRule="atLeast"/>
+        </w:trPr>
+        <w:tc>
+          <w:tcPr>
+            <w:tcW w:w="2337" w:type="dxa"/>
+            <w:vMerge w:val="continue"/>
+            <w:tcBorders/>
+          </w:tcPr>
+          <w:p>
+            <w:pPr>
+              <w:spacing w:after="0" w:line="240" w:lineRule="auto"/>
+              <w:rPr>
+                <w:rFonts w:ascii="Times New Roman" w:hAnsi="Times New Roman" w:cs="Times New Roman"/>
+                <w:sz w:val="24"/>
+                <w:szCs w:val="24"/>
+              </w:rPr>
+            </w:pPr>
+          </w:p>
+        </w:tc>
+        <w:tc>
+          <w:tcPr>
+            <w:tcW w:w="2337" w:type="dxa"/>
+            <w:shd w:val="clear"/>
+            <w:vAlign w:val="top"/>
+          </w:tcPr>
+          <w:p>
+            <w:pPr>
+              <w:spacing w:after="0" w:line="240" w:lineRule="auto"/>
+              <w:rPr>
+                <w:rFonts w:ascii="Times New Roman" w:hAnsi="Times New Roman" w:cs="Times New Roman" w:eastAsiaTheme="minorEastAsia"/>
+                <w:sz w:val="24"/>
+                <w:szCs w:val="24"/>
+                <w:lang w:val="en-US" w:eastAsia="zh-CN" w:bidi="ar-SA"/>
               </w:rPr>
             </w:pPr>
             <w:r>
@@ -1673,14 +1995,17 @@
         <w:tc>
           <w:tcPr>
             <w:tcW w:w="2338" w:type="dxa"/>
-          </w:tcPr>
-          <w:p>
-            <w:pPr>
-              <w:spacing w:after="0" w:line="240" w:lineRule="auto"/>
-              <w:rPr>
-                <w:rFonts w:ascii="Times New Roman" w:hAnsi="Times New Roman" w:cs="Times New Roman"/>
-                <w:sz w:val="24"/>
-                <w:szCs w:val="24"/>
+            <w:shd w:val="clear"/>
+            <w:vAlign w:val="top"/>
+          </w:tcPr>
+          <w:p>
+            <w:pPr>
+              <w:spacing w:after="0" w:line="240" w:lineRule="auto"/>
+              <w:rPr>
+                <w:rFonts w:ascii="Times New Roman" w:hAnsi="Times New Roman" w:cs="Times New Roman" w:eastAsiaTheme="minorEastAsia"/>
+                <w:sz w:val="24"/>
+                <w:szCs w:val="24"/>
+                <w:lang w:val="en-US" w:eastAsia="zh-CN" w:bidi="ar-SA"/>
               </w:rPr>
             </w:pPr>
             <w:r>
@@ -1696,14 +2021,17 @@
         <w:tc>
           <w:tcPr>
             <w:tcW w:w="2696" w:type="dxa"/>
-          </w:tcPr>
-          <w:p>
-            <w:pPr>
-              <w:spacing w:after="0" w:line="240" w:lineRule="auto"/>
-              <w:rPr>
-                <w:rFonts w:ascii="Times New Roman" w:hAnsi="Times New Roman" w:cs="Times New Roman"/>
-                <w:sz w:val="24"/>
-                <w:szCs w:val="24"/>
+            <w:shd w:val="clear"/>
+            <w:vAlign w:val="top"/>
+          </w:tcPr>
+          <w:p>
+            <w:pPr>
+              <w:spacing w:after="0" w:line="240" w:lineRule="auto"/>
+              <w:rPr>
+                <w:rFonts w:ascii="Times New Roman" w:hAnsi="Times New Roman" w:cs="Times New Roman" w:eastAsiaTheme="minorEastAsia"/>
+                <w:sz w:val="24"/>
+                <w:szCs w:val="24"/>
+                <w:lang w:val="en-US" w:eastAsia="zh-CN" w:bidi="ar-SA"/>
               </w:rPr>
             </w:pPr>
             <w:r>
@@ -1730,7 +2058,6 @@
       </w:pPr>
     </w:p>
     <w:p>
-      <w:bookmarkStart w:id="0" w:name="_GoBack"/>
       <w:r>
         <w:rPr>
           <w:sz w:val="22"/>
@@ -2042,7 +2369,6 @@
         </mc:AlternateContent>
       </w:r>
     </w:p>
-    <w:bookmarkEnd w:id="0"/>
     <w:sectPr>
       <w:pgSz w:w="11906" w:h="16838"/>
       <w:pgMar w:top="1440" w:right="1800" w:bottom="1440" w:left="1140" w:header="720" w:footer="720" w:gutter="0"/>
@@ -2300,7 +2626,7 @@
     <w:lsdException w:qFormat="1" w:unhideWhenUsed="0" w:uiPriority="0" w:semiHidden="0" w:name="Title"/>
     <w:lsdException w:unhideWhenUsed="0" w:uiPriority="0" w:semiHidden="0" w:name="Closing"/>
     <w:lsdException w:unhideWhenUsed="0" w:uiPriority="0" w:semiHidden="0" w:name="Signature"/>
-    <w:lsdException w:unhideWhenUsed="0" w:uiPriority="0" w:name="Default Paragraph Font"/>
+    <w:lsdException w:qFormat="1" w:unhideWhenUsed="0" w:uiPriority="0" w:name="Default Paragraph Font"/>
     <w:lsdException w:unhideWhenUsed="0" w:uiPriority="0" w:semiHidden="0" w:name="Body Text"/>
     <w:lsdException w:unhideWhenUsed="0" w:uiPriority="0" w:semiHidden="0" w:name="Body Text Indent"/>
     <w:lsdException w:unhideWhenUsed="0" w:uiPriority="0" w:semiHidden="0" w:name="List Continue"/>
@@ -2338,7 +2664,7 @@
     <w:lsdException w:unhideWhenUsed="0" w:uiPriority="0" w:semiHidden="0" w:name="HTML Sample"/>
     <w:lsdException w:unhideWhenUsed="0" w:uiPriority="0" w:semiHidden="0" w:name="HTML Typewriter"/>
     <w:lsdException w:unhideWhenUsed="0" w:uiPriority="0" w:semiHidden="0" w:name="HTML Variable"/>
-    <w:lsdException w:unhideWhenUsed="0" w:uiPriority="0" w:name="Normal Table"/>
+    <w:lsdException w:qFormat="1" w:unhideWhenUsed="0" w:uiPriority="0" w:name="Normal Table"/>
     <w:lsdException w:unhideWhenUsed="0" w:uiPriority="0" w:semiHidden="0" w:name="annotation subject"/>
     <w:lsdException w:unhideWhenUsed="0" w:uiPriority="0" w:semiHidden="0" w:name="Table Simple 1"/>
     <w:lsdException w:unhideWhenUsed="0" w:uiPriority="0" w:semiHidden="0" w:name="Table Simple 2"/>
@@ -2502,11 +2828,13 @@
   <w:style w:type="character" w:default="1" w:styleId="2">
     <w:name w:val="Default Paragraph Font"/>
     <w:semiHidden/>
+    <w:qFormat/>
     <w:uiPriority w:val="0"/>
   </w:style>
   <w:style w:type="table" w:default="1" w:styleId="3">
     <w:name w:val="Normal Table"/>
     <w:semiHidden/>
+    <w:qFormat/>
     <w:uiPriority w:val="0"/>
     <w:tblPr>
       <w:tblCellMar>

</xml_diff>